<commit_message>
docs(huong-dan): add anomaly warnings section to unit leader guide
</commit_message>
<xml_diff>
--- a/docs/huong-dan/lanh-dao-don-vi/Huong-dan-lanh-dao-don-vi.docx
+++ b/docs/huong-dan/lanh-dao-don-vi/Huong-dan-lanh-dao-don-vi.docx
@@ -16,7 +16,7 @@
         <w:spacing w:after="200"/>
       </w:pPr>
       <w:r>
-        <w:t xml:space="preserve">Tài liệu dành cho lãnh đạo các đơn vị thành viên VRG. Tài khoản lãnh đạo có hai việc chính: (1) trao đổi hai chiều với Tập đoàn qua mục Hỗ trợ &amp; Thông báo — nhận thông báo, nhận nhắc lịch, gửi yêu cầu hỗ trợ, có báo qua email; (2) theo dõi toàn bộ số liệu của đơn vị mình — thu mua, tồn kho, kế hoạch năm, khách hàng, hợp đồng và báo cáo tiêu thụ. Tài khoản lãnh đạo chỉ XEM số liệu; việc nhập/sửa do tài khoản nhập liệu của đơn vị thực hiện.</w:t>
+        <w:t xml:space="preserve">Tài liệu dành cho lãnh đạo các đơn vị thành viên VRG. Tài khoản lãnh đạo có ba việc chính: (1) trao đổi hai chiều với Tập đoàn qua mục Hỗ trợ &amp; Thông báo — nhận thông báo, nhận nhắc lịch, gửi yêu cầu hỗ trợ, có báo qua email; (2) xem Cảnh báo bất thường để biết nhân viên nhập liệu đang nhập sai hoặc còn thiếu gì, rồi nhắc đúng việc; (3) theo dõi toàn bộ số liệu của đơn vị mình — thu mua, tồn kho, kế hoạch năm, khách hàng, hợp đồng và báo cáo tiêu thụ. Tài khoản lãnh đạo chỉ XEM số liệu; việc nhập/sửa do tài khoản nhập liệu của đơn vị thực hiện.</w:t>
       </w:r>
     </w:p>
     <w:p>
@@ -47,7 +47,7 @@
         <w:spacing w:after="140"/>
       </w:pPr>
       <w:r>
-        <w:t xml:space="preserve">Sau khi đăng nhập, menu bên trái gồm bốn phần. Chữ “(chỉ xem)” trên tên nhóm nghĩa là phần đó chỉ để theo dõi, không có nút nhập hay sửa.</w:t>
+        <w:t xml:space="preserve">Sau khi đăng nhập, menu bên trái gồm các phần dưới đây. Chữ “(chỉ xem)” trên tên nhóm nghĩa là phần đó chỉ để theo dõi, không có nút nhập hay sửa.</w:t>
       </w:r>
     </w:p>
     <w:p>
@@ -158,10 +158,30 @@
           <w:b/>
           <w:bCs/>
         </w:rPr>
+        <w:t xml:space="preserve">Cảnh báo bất thường</w:t>
+      </w:r>
+      <w:r>
+        <w:t xml:space="preserve"> — những chỗ nhân viên nhập liệu đang nhập sai hoặc còn thiếu (mục 9).</w:t>
+      </w:r>
+    </w:p>
+    <w:p>
+      <w:pPr>
+        <w:pStyle w:val="ListParagraph"/>
+        <w:numPr>
+          <w:ilvl w:val="0"/>
+          <w:numId w:val="2"/>
+        </w:numPr>
+        <w:spacing w:after="100"/>
+      </w:pPr>
+      <w:r>
+        <w:rPr>
+          <w:b/>
+          <w:bCs/>
+        </w:rPr>
         <w:t xml:space="preserve">Số liệu đơn vị (chỉ xem)</w:t>
       </w:r>
       <w:r>
-        <w:t xml:space="preserve"> — Thu mua theo ngày, Tồn kho theo ngày, Nhu cầu thị trường, Kế hoạch năm.</w:t>
+        <w:t xml:space="preserve"> — Thu mua theo ngày, Tồn kho theo ngày, Nhu cầu thị trường, Kế hoạch năm, Đề nghị sửa số liệu.</w:t>
       </w:r>
     </w:p>
     <w:p>
@@ -1734,7 +1754,7 @@
         <w:pageBreakBefore/>
       </w:pPr>
       <w:r>
-        <w:t xml:space="preserve">9. Xem số liệu thu mua theo ngày</w:t>
+        <w:t xml:space="preserve">9. Cảnh báo bất thường — nhắc nhân viên đúng việc</w:t>
       </w:r>
     </w:p>
     <w:p>
@@ -1749,7 +1769,7 @@
         <w:t xml:space="preserve">Vị trí: </w:t>
       </w:r>
       <w:r>
-        <w:t xml:space="preserve">Menu ▸ Số liệu đơn vị (chỉ xem) ▸ Thu mua (theo ngày)</w:t>
+        <w:t xml:space="preserve">Menu ▸ Cảnh báo bất thường</w:t>
       </w:r>
     </w:p>
     <w:p>
@@ -1757,7 +1777,7 @@
         <w:spacing w:after="140"/>
       </w:pPr>
       <w:r>
-        <w:t xml:space="preserve">Sản lượng và đơn giá thu mua mủ nguyên liệu của đơn vị, theo từng ngày.</w:t>
+        <w:t xml:space="preserve">Trang này gom những chỗ nhân viên nhập liệu của đơn vị đang nhập sai hoặc còn thiếu. Mở ra là biết cần nhắc ai, sửa gì. Nhóm nghiêm trọng nằm trên cùng.</w:t>
       </w:r>
     </w:p>
     <w:p>
@@ -1770,7 +1790,7 @@
           <wp:inline distT="0" distB="0" distL="0" distR="0">
             <wp:extent cx="6191250" cy="2800350"/>
             <wp:effectExtent t="0" r="0" b="0" l="0"/>
-            <wp:docPr id="1" name="img" descr="Ảnh hướng dẫn có đánh số bước" title="img/08-thu-mua.png"/>
+            <wp:docPr id="1" name="img" descr="Ảnh hướng dẫn có đánh số bước" title="img/17-canh-bao-bat-thuong.png"/>
             <wp:cNvGraphicFramePr>
               <a:graphicFrameLocks xmlns:a="http://schemas.openxmlformats.org/drawingml/2006/main" noChangeAspect="1"/>
             </wp:cNvGraphicFramePr>
@@ -1819,7 +1839,7 @@
           <w:sz w:val="17"/>
           <w:szCs w:val="17"/>
         </w:rPr>
-        <w:t xml:space="preserve">Hình 8. Báo cáo thu mua theo ngày</w:t>
+        <w:t xml:space="preserve">Hình 8. Cảnh báo bất thường của đơn vị</w:t>
       </w:r>
     </w:p>
     <w:p>
@@ -1844,17 +1864,24 @@
         <w:spacing w:after="100"/>
       </w:pPr>
       <w:r>
-        <w:t xml:space="preserve">Dòng thông báo </w:t>
-      </w:r>
-      <w:r>
-        <w:rPr>
-          <w:b/>
-          <w:bCs/>
-        </w:rPr>
-        <w:t xml:space="preserve">“Chế độ chỉ xem”</w:t>
-      </w:r>
-      <w:r>
-        <w:t xml:space="preserve"> nhắc rằng màn này chỉ để theo dõi.</w:t>
+        <w:rPr>
+          <w:b/>
+          <w:bCs/>
+        </w:rPr>
+        <w:t xml:space="preserve">Khoảng ngày</w:t>
+      </w:r>
+      <w:r>
+        <w:t xml:space="preserve"> — mặc định từ đầu năm đến hôm qua. Đổi ngày xong bấm </w:t>
+      </w:r>
+      <w:r>
+        <w:rPr>
+          <w:b/>
+          <w:bCs/>
+        </w:rPr>
+        <w:t xml:space="preserve">Quét lại</w:t>
+      </w:r>
+      <w:r>
+        <w:t xml:space="preserve">.</w:t>
       </w:r>
     </w:p>
     <w:p>
@@ -1871,10 +1898,10 @@
           <w:b/>
           <w:bCs/>
         </w:rPr>
-        <w:t xml:space="preserve">Khoảng thời gian</w:t>
-      </w:r>
-      <w:r>
-        <w:t xml:space="preserve"> — chọn 30 / 60 / 90 / 180 ngày gần nhất, hoặc tự chọn khoảng ngày.</w:t>
+        <w:t xml:space="preserve">Thẻ tổng quan</w:t>
+      </w:r>
+      <w:r>
+        <w:t xml:space="preserve"> — tổng số cảnh báo, chia theo mức: *Nghiêm trọng* (cần sửa ngay), *Cần xem*, *Ghi nhận*.</w:t>
       </w:r>
     </w:p>
     <w:p>
@@ -1891,10 +1918,10 @@
           <w:b/>
           <w:bCs/>
         </w:rPr>
-        <w:t xml:space="preserve">Biểu tượng con mắt</w:t>
-      </w:r>
-      <w:r>
-        <w:t xml:space="preserve"> ở cuối mỗi dòng — mở phiếu của đúng ngày đó để xem chi tiết.</w:t>
+        <w:t xml:space="preserve">Từng nhóm cảnh báo</w:t>
+      </w:r>
+      <w:r>
+        <w:t xml:space="preserve"> — tên lỗi, mức độ và một dòng giải thích. Nhóm có việc được mở sẵn; nhóm không có lỗi bị gạch ngang ở cuối trang.</w:t>
       </w:r>
     </w:p>
     <w:p>
@@ -1907,17 +1934,54 @@
         <w:spacing w:after="100"/>
       </w:pPr>
       <w:r>
-        <w:t xml:space="preserve">Dòng </w:t>
-      </w:r>
-      <w:r>
-        <w:rPr>
-          <w:b/>
-          <w:bCs/>
-        </w:rPr>
-        <w:t xml:space="preserve">Lũy kế (khoảng đang xem)</w:t>
-      </w:r>
-      <w:r>
-        <w:t xml:space="preserve"> ở cuối bảng cộng toàn bộ khoảng đang chọn.</w:t>
+        <w:rPr>
+          <w:b/>
+          <w:bCs/>
+        </w:rPr>
+        <w:t xml:space="preserve">Bảng chi tiết</w:t>
+      </w:r>
+      <w:r>
+        <w:t xml:space="preserve"> — ngày, loại mủ, mã hợp đồng… để nhân viên tìm đúng chỗ cần sửa.</w:t>
+      </w:r>
+    </w:p>
+    <w:p>
+      <w:pPr>
+        <w:pStyle w:val="ListParagraph"/>
+        <w:numPr>
+          <w:ilvl w:val="0"/>
+          <w:numId w:val="11"/>
+        </w:numPr>
+        <w:spacing w:after="100"/>
+      </w:pPr>
+      <w:r>
+        <w:rPr>
+          <w:b/>
+          <w:bCs/>
+        </w:rPr>
+        <w:t xml:space="preserve">Xuất Excel</w:t>
+      </w:r>
+      <w:r>
+        <w:t xml:space="preserve"> — tải danh sách gửi nhân viên. Nút </w:t>
+      </w:r>
+      <w:r>
+        <w:rPr>
+          <w:b/>
+          <w:bCs/>
+        </w:rPr>
+        <w:t xml:space="preserve">Chế độ chụp</w:t>
+      </w:r>
+      <w:r>
+        <w:t xml:space="preserve"> bên cạnh ẩn menu để chụp ảnh gọn gửi qua Zalo; bấm </w:t>
+      </w:r>
+      <w:r>
+        <w:rPr>
+          <w:b/>
+          <w:bCs/>
+        </w:rPr>
+        <w:t xml:space="preserve">Esc</w:t>
+      </w:r>
+      <w:r>
+        <w:t xml:space="preserve"> để thoát.</w:t>
       </w:r>
     </w:p>
     <w:p>
@@ -1942,7 +2006,7 @@
         <w:spacing w:after="80"/>
       </w:pPr>
       <w:r>
-        <w:t xml:space="preserve">Mục này chỉ hiện với đơn vị được giao kế hoạch thu mua. Đơn vị không tổ chức thu mua sẽ không thấy mục này trong menu.</w:t>
+        <w:t xml:space="preserve">Trang chỉ có số liệu của đơn vị mình, kể cả đơn vị đã sáp nhập vào đơn vị mình.</w:t>
       </w:r>
     </w:p>
     <w:p>
@@ -1955,17 +2019,30 @@
         <w:spacing w:after="80"/>
       </w:pPr>
       <w:r>
-        <w:t xml:space="preserve">Sản lượng ghi theo </w:t>
-      </w:r>
-      <w:r>
-        <w:rPr>
-          <w:b/>
-          <w:bCs/>
-        </w:rPr>
-        <w:t xml:space="preserve">tấn quy khô</w:t>
-      </w:r>
-      <w:r>
-        <w:t xml:space="preserve">; đơn giá mủ nước theo đồng/độ TSC, mủ chén theo đồng/độ DRC.</w:t>
+        <w:t xml:space="preserve">Cảnh báo là dấu hiệu cần kiểm tra, chưa chắc số đã sai. Nhắc nhân viên xem lại; ngày đã khoá thì nhân viên gửi </w:t>
+      </w:r>
+      <w:r>
+        <w:rPr>
+          <w:b/>
+          <w:bCs/>
+        </w:rPr>
+        <w:t xml:space="preserve">Đề nghị sửa số liệu</w:t>
+      </w:r>
+      <w:r>
+        <w:t xml:space="preserve"> để Tập đoàn duyệt.</w:t>
+      </w:r>
+    </w:p>
+    <w:p>
+      <w:pPr>
+        <w:pStyle w:val="ListParagraph"/>
+        <w:numPr>
+          <w:ilvl w:val="0"/>
+          <w:numId w:val="3"/>
+        </w:numPr>
+        <w:spacing w:after="80"/>
+      </w:pPr>
+      <w:r>
+        <w:t xml:space="preserve">Lỗi hay gặp nhất: giá bán gõ đồng thay cho triệu đồng/tấn, giá mủ gõ đồng/kg thay cho đồng/độ, quên nộp biểu ngày, có sản lượng mà quên đơn giá.</w:t>
       </w:r>
     </w:p>
     <w:p>
@@ -1974,7 +2051,7 @@
         <w:pageBreakBefore/>
       </w:pPr>
       <w:r>
-        <w:t xml:space="preserve">10. Xem tồn kho theo ngày</w:t>
+        <w:t xml:space="preserve">10. Xem số liệu thu mua theo ngày</w:t>
       </w:r>
     </w:p>
     <w:p>
@@ -1989,7 +2066,7 @@
         <w:t xml:space="preserve">Vị trí: </w:t>
       </w:r>
       <w:r>
-        <w:t xml:space="preserve">Menu ▸ Số liệu đơn vị (chỉ xem) ▸ Tồn kho (theo ngày)</w:t>
+        <w:t xml:space="preserve">Menu ▸ Số liệu đơn vị (chỉ xem) ▸ Thu mua (theo ngày)</w:t>
       </w:r>
     </w:p>
     <w:p>
@@ -1997,7 +2074,7 @@
         <w:spacing w:after="140"/>
       </w:pPr>
       <w:r>
-        <w:t xml:space="preserve">Ảnh chụp kho của đơn vị theo từng ngày, kèm số tiêu thụ cộng dồn từ các lần giao trên hợp đồng.</w:t>
+        <w:t xml:space="preserve">Sản lượng và đơn giá thu mua mủ nguyên liệu của đơn vị, theo từng ngày.</w:t>
       </w:r>
     </w:p>
     <w:p>
@@ -2010,7 +2087,7 @@
           <wp:inline distT="0" distB="0" distL="0" distR="0">
             <wp:extent cx="6191250" cy="2800350"/>
             <wp:effectExtent t="0" r="0" b="0" l="0"/>
-            <wp:docPr id="1" name="img" descr="Ảnh hướng dẫn có đánh số bước" title="img/09-ton-kho.png"/>
+            <wp:docPr id="1" name="img" descr="Ảnh hướng dẫn có đánh số bước" title="img/08-thu-mua.png"/>
             <wp:cNvGraphicFramePr>
               <a:graphicFrameLocks xmlns:a="http://schemas.openxmlformats.org/drawingml/2006/main" noChangeAspect="1"/>
             </wp:cNvGraphicFramePr>
@@ -2059,7 +2136,7 @@
           <w:sz w:val="17"/>
           <w:szCs w:val="17"/>
         </w:rPr>
-        <w:t xml:space="preserve">Hình 9. Báo cáo tồn kho theo ngày</w:t>
+        <w:t xml:space="preserve">Hình 9. Báo cáo thu mua theo ngày</w:t>
       </w:r>
     </w:p>
     <w:p>
@@ -2084,8 +2161,28 @@
         <w:spacing w:after="100"/>
       </w:pPr>
       <w:r>
-        <w:t xml:space="preserve">Chọn </w:t>
-      </w:r>
+        <w:t xml:space="preserve">Dòng thông báo </w:t>
+      </w:r>
+      <w:r>
+        <w:rPr>
+          <w:b/>
+          <w:bCs/>
+        </w:rPr>
+        <w:t xml:space="preserve">“Chế độ chỉ xem”</w:t>
+      </w:r>
+      <w:r>
+        <w:t xml:space="preserve"> nhắc rằng màn này chỉ để theo dõi.</w:t>
+      </w:r>
+    </w:p>
+    <w:p>
+      <w:pPr>
+        <w:pStyle w:val="ListParagraph"/>
+        <w:numPr>
+          <w:ilvl w:val="0"/>
+          <w:numId w:val="12"/>
+        </w:numPr>
+        <w:spacing w:after="100"/>
+      </w:pPr>
       <w:r>
         <w:rPr>
           <w:b/>
@@ -2094,7 +2191,7 @@
         <w:t xml:space="preserve">Khoảng thời gian</w:t>
       </w:r>
       <w:r>
-        <w:t xml:space="preserve"> muốn xem.</w:t>
+        <w:t xml:space="preserve"> — chọn 30 / 60 / 90 / 180 ngày gần nhất, hoặc tự chọn khoảng ngày.</w:t>
       </w:r>
     </w:p>
     <w:p>
@@ -2107,17 +2204,14 @@
         <w:spacing w:after="100"/>
       </w:pPr>
       <w:r>
-        <w:t xml:space="preserve">Nhóm cột </w:t>
-      </w:r>
-      <w:r>
-        <w:rPr>
-          <w:b/>
-          <w:bCs/>
-        </w:rPr>
-        <w:t xml:space="preserve">Tiêu thụ (theo hợp đồng)</w:t>
-      </w:r>
-      <w:r>
-        <w:t xml:space="preserve"> — tổng tiêu thụ, xuất khẩu, trong nước, nội bộ, doanh thu và giá bán bình quân.</w:t>
+        <w:rPr>
+          <w:b/>
+          <w:bCs/>
+        </w:rPr>
+        <w:t xml:space="preserve">Biểu tượng con mắt</w:t>
+      </w:r>
+      <w:r>
+        <w:t xml:space="preserve"> ở cuối mỗi dòng — mở phiếu của đúng ngày đó để xem chi tiết.</w:t>
       </w:r>
     </w:p>
     <w:p>
@@ -2130,50 +2224,17 @@
         <w:spacing w:after="100"/>
       </w:pPr>
       <w:r>
-        <w:t xml:space="preserve">Hai cột tồn kho — </w:t>
-      </w:r>
-      <w:r>
-        <w:rPr>
-          <w:b/>
-          <w:bCs/>
-        </w:rPr>
-        <w:t xml:space="preserve">Chế biến chưa nhập kho</w:t>
-      </w:r>
-      <w:r>
-        <w:t xml:space="preserve"> và </w:t>
-      </w:r>
-      <w:r>
-        <w:rPr>
-          <w:b/>
-          <w:bCs/>
-        </w:rPr>
-        <w:t xml:space="preserve">Đã nhập kho</w:t>
-      </w:r>
-      <w:r>
-        <w:t xml:space="preserve"> (tấn).</w:t>
-      </w:r>
-    </w:p>
-    <w:p>
-      <w:pPr>
-        <w:pStyle w:val="ListParagraph"/>
-        <w:numPr>
-          <w:ilvl w:val="0"/>
-          <w:numId w:val="12"/>
-        </w:numPr>
-        <w:spacing w:after="100"/>
-      </w:pPr>
-      <w:r>
-        <w:t xml:space="preserve">Bấm </w:t>
-      </w:r>
-      <w:r>
-        <w:rPr>
-          <w:b/>
-          <w:bCs/>
-        </w:rPr>
-        <w:t xml:space="preserve">biểu tượng con mắt</w:t>
-      </w:r>
-      <w:r>
-        <w:t xml:space="preserve"> để mở phiếu chi tiết của ngày đó, xem tồn theo từng chủng loại.</w:t>
+        <w:t xml:space="preserve">Dòng </w:t>
+      </w:r>
+      <w:r>
+        <w:rPr>
+          <w:b/>
+          <w:bCs/>
+        </w:rPr>
+        <w:t xml:space="preserve">Lũy kế (khoảng đang xem)</w:t>
+      </w:r>
+      <w:r>
+        <w:t xml:space="preserve"> ở cuối bảng cộng toàn bộ khoảng đang chọn.</w:t>
       </w:r>
     </w:p>
     <w:p>
@@ -2198,17 +2259,7 @@
         <w:spacing w:after="80"/>
       </w:pPr>
       <w:r>
-        <w:t xml:space="preserve">Tồn kho là số tại thời điểm, nên dòng Lũy kế lấy </w:t>
-      </w:r>
-      <w:r>
-        <w:rPr>
-          <w:b/>
-          <w:bCs/>
-        </w:rPr>
-        <w:t xml:space="preserve">số mới nhất</w:t>
-      </w:r>
-      <w:r>
-        <w:t xml:space="preserve"> của đơn vị, không cộng dồn các ngày.</w:t>
+        <w:t xml:space="preserve">Mục này chỉ hiện với đơn vị được giao kế hoạch thu mua. Đơn vị không tổ chức thu mua sẽ không thấy mục này trong menu.</w:t>
       </w:r>
     </w:p>
     <w:p>
@@ -2221,17 +2272,17 @@
         <w:spacing w:after="80"/>
       </w:pPr>
       <w:r>
-        <w:t xml:space="preserve">Số tiêu thụ không nhập tay: hệ thống cộng từ các </w:t>
-      </w:r>
-      <w:r>
-        <w:rPr>
-          <w:b/>
-          <w:bCs/>
-        </w:rPr>
-        <w:t xml:space="preserve">đợt giao</w:t>
-      </w:r>
-      <w:r>
-        <w:t xml:space="preserve"> ghi trên hợp đồng.</w:t>
+        <w:t xml:space="preserve">Sản lượng ghi theo </w:t>
+      </w:r>
+      <w:r>
+        <w:rPr>
+          <w:b/>
+          <w:bCs/>
+        </w:rPr>
+        <w:t xml:space="preserve">tấn quy khô</w:t>
+      </w:r>
+      <w:r>
+        <w:t xml:space="preserve">; đơn giá mủ nước theo đồng/độ TSC, mủ chén theo đồng/độ DRC.</w:t>
       </w:r>
     </w:p>
     <w:p>
@@ -2240,7 +2291,7 @@
         <w:pageBreakBefore/>
       </w:pPr>
       <w:r>
-        <w:t xml:space="preserve">11. Nhu cầu thị trường</w:t>
+        <w:t xml:space="preserve">11. Xem tồn kho theo ngày</w:t>
       </w:r>
     </w:p>
     <w:p>
@@ -2255,7 +2306,7 @@
         <w:t xml:space="preserve">Vị trí: </w:t>
       </w:r>
       <w:r>
-        <w:t xml:space="preserve">Menu ▸ Số liệu đơn vị (chỉ xem) ▸ Nhu cầu thị trường</w:t>
+        <w:t xml:space="preserve">Menu ▸ Số liệu đơn vị (chỉ xem) ▸ Tồn kho (theo ngày)</w:t>
       </w:r>
     </w:p>
     <w:p>
@@ -2263,7 +2314,7 @@
         <w:spacing w:after="140"/>
       </w:pPr>
       <w:r>
-        <w:t xml:space="preserve">Các lời chào hàng, hỏi mua mà đơn vị nắm được, ghi theo ngày. Đây là phần thông tin thị trường đơn vị báo về Tập đoàn.</w:t>
+        <w:t xml:space="preserve">Ảnh chụp kho của đơn vị theo từng ngày, kèm số tiêu thụ cộng dồn từ các lần giao trên hợp đồng.</w:t>
       </w:r>
     </w:p>
     <w:p>
@@ -2274,9 +2325,9 @@
       <w:r>
         <w:drawing>
           <wp:inline distT="0" distB="0" distL="0" distR="0">
-            <wp:extent cx="6191250" cy="3552825"/>
+            <wp:extent cx="6191250" cy="2800350"/>
             <wp:effectExtent t="0" r="0" b="0" l="0"/>
-            <wp:docPr id="1" name="img" descr="Ảnh hướng dẫn có đánh số bước" title="img/10-nhu-cau-thi-truong.png"/>
+            <wp:docPr id="1" name="img" descr="Ảnh hướng dẫn có đánh số bước" title="img/09-ton-kho.png"/>
             <wp:cNvGraphicFramePr>
               <a:graphicFrameLocks xmlns:a="http://schemas.openxmlformats.org/drawingml/2006/main" noChangeAspect="1"/>
             </wp:cNvGraphicFramePr>
@@ -2299,7 +2350,7 @@
                   <pic:spPr bwMode="auto">
                     <a:xfrm>
                       <a:off x="0" y="0"/>
-                      <a:ext cx="6191250" cy="3552825"/>
+                      <a:ext cx="6191250" cy="2800350"/>
                     </a:xfrm>
                     <a:prstGeom prst="rect">
                       <a:avLst/>
@@ -2325,7 +2376,7 @@
           <w:sz w:val="17"/>
           <w:szCs w:val="17"/>
         </w:rPr>
-        <w:t xml:space="preserve">Hình 10. Nhu cầu thị trường theo ngày</w:t>
+        <w:t xml:space="preserve">Hình 10. Báo cáo tồn kho theo ngày</w:t>
       </w:r>
     </w:p>
     <w:p>
@@ -2350,7 +2401,17 @@
         <w:spacing w:after="100"/>
       </w:pPr>
       <w:r>
-        <w:t xml:space="preserve">Dòng thông báo chế độ chỉ xem.</w:t>
+        <w:t xml:space="preserve">Chọn </w:t>
+      </w:r>
+      <w:r>
+        <w:rPr>
+          <w:b/>
+          <w:bCs/>
+        </w:rPr>
+        <w:t xml:space="preserve">Khoảng thời gian</w:t>
+      </w:r>
+      <w:r>
+        <w:t xml:space="preserve"> muốn xem.</w:t>
       </w:r>
     </w:p>
     <w:p>
@@ -2363,14 +2424,17 @@
         <w:spacing w:after="100"/>
       </w:pPr>
       <w:r>
-        <w:rPr>
-          <w:b/>
-          <w:bCs/>
-        </w:rPr>
-        <w:t xml:space="preserve">Khoảng thời gian</w:t>
-      </w:r>
-      <w:r>
-        <w:t xml:space="preserve"> — 30 / 60 / 90 / 180 / 365 ngày gần nhất.</w:t>
+        <w:t xml:space="preserve">Nhóm cột </w:t>
+      </w:r>
+      <w:r>
+        <w:rPr>
+          <w:b/>
+          <w:bCs/>
+        </w:rPr>
+        <w:t xml:space="preserve">Tiêu thụ (theo hợp đồng)</w:t>
+      </w:r>
+      <w:r>
+        <w:t xml:space="preserve"> — tổng tiêu thụ, xuất khẩu, trong nước, nội bộ, doanh thu và giá bán bình quân.</w:t>
       </w:r>
     </w:p>
     <w:p>
@@ -2383,7 +2447,50 @@
         <w:spacing w:after="100"/>
       </w:pPr>
       <w:r>
-        <w:t xml:space="preserve">Nội dung xếp theo ngày, mới nhất lên trên; mỗi dòng ghi tên đơn vị và nội dung nhu cầu.</w:t>
+        <w:t xml:space="preserve">Hai cột tồn kho — </w:t>
+      </w:r>
+      <w:r>
+        <w:rPr>
+          <w:b/>
+          <w:bCs/>
+        </w:rPr>
+        <w:t xml:space="preserve">Chế biến chưa nhập kho</w:t>
+      </w:r>
+      <w:r>
+        <w:t xml:space="preserve"> và </w:t>
+      </w:r>
+      <w:r>
+        <w:rPr>
+          <w:b/>
+          <w:bCs/>
+        </w:rPr>
+        <w:t xml:space="preserve">Đã nhập kho</w:t>
+      </w:r>
+      <w:r>
+        <w:t xml:space="preserve"> (tấn).</w:t>
+      </w:r>
+    </w:p>
+    <w:p>
+      <w:pPr>
+        <w:pStyle w:val="ListParagraph"/>
+        <w:numPr>
+          <w:ilvl w:val="0"/>
+          <w:numId w:val="13"/>
+        </w:numPr>
+        <w:spacing w:after="100"/>
+      </w:pPr>
+      <w:r>
+        <w:t xml:space="preserve">Bấm </w:t>
+      </w:r>
+      <w:r>
+        <w:rPr>
+          <w:b/>
+          <w:bCs/>
+        </w:rPr>
+        <w:t xml:space="preserve">biểu tượng con mắt</w:t>
+      </w:r>
+      <w:r>
+        <w:t xml:space="preserve"> để mở phiếu chi tiết của ngày đó, xem tồn theo từng chủng loại.</w:t>
       </w:r>
     </w:p>
     <w:p>
@@ -2408,7 +2515,40 @@
         <w:spacing w:after="80"/>
       </w:pPr>
       <w:r>
-        <w:t xml:space="preserve">Chỉ những ngày có nhập mới hiện. Ngày trống nghĩa là hôm đó đơn vị không ghi nhận nhu cầu nào.</w:t>
+        <w:t xml:space="preserve">Tồn kho là số tại thời điểm, nên dòng Lũy kế lấy </w:t>
+      </w:r>
+      <w:r>
+        <w:rPr>
+          <w:b/>
+          <w:bCs/>
+        </w:rPr>
+        <w:t xml:space="preserve">số mới nhất</w:t>
+      </w:r>
+      <w:r>
+        <w:t xml:space="preserve"> của đơn vị, không cộng dồn các ngày.</w:t>
+      </w:r>
+    </w:p>
+    <w:p>
+      <w:pPr>
+        <w:pStyle w:val="ListParagraph"/>
+        <w:numPr>
+          <w:ilvl w:val="0"/>
+          <w:numId w:val="3"/>
+        </w:numPr>
+        <w:spacing w:after="80"/>
+      </w:pPr>
+      <w:r>
+        <w:t xml:space="preserve">Số tiêu thụ không nhập tay: hệ thống cộng từ các </w:t>
+      </w:r>
+      <w:r>
+        <w:rPr>
+          <w:b/>
+          <w:bCs/>
+        </w:rPr>
+        <w:t xml:space="preserve">đợt giao</w:t>
+      </w:r>
+      <w:r>
+        <w:t xml:space="preserve"> ghi trên hợp đồng.</w:t>
       </w:r>
     </w:p>
     <w:p>
@@ -2417,7 +2557,7 @@
         <w:pageBreakBefore/>
       </w:pPr>
       <w:r>
-        <w:t xml:space="preserve">12. Kế hoạch năm</w:t>
+        <w:t xml:space="preserve">12. Nhu cầu thị trường</w:t>
       </w:r>
     </w:p>
     <w:p>
@@ -2432,7 +2572,7 @@
         <w:t xml:space="preserve">Vị trí: </w:t>
       </w:r>
       <w:r>
-        <w:t xml:space="preserve">Menu ▸ Số liệu đơn vị (chỉ xem) ▸ Kế hoạch năm</w:t>
+        <w:t xml:space="preserve">Menu ▸ Số liệu đơn vị (chỉ xem) ▸ Nhu cầu thị trường</w:t>
       </w:r>
     </w:p>
     <w:p>
@@ -2440,7 +2580,7 @@
         <w:spacing w:after="140"/>
       </w:pPr>
       <w:r>
-        <w:t xml:space="preserve">Chỉ tiêu cả năm của đơn vị — cơ sở để hệ thống tính phần trăm thực hiện trên các báo cáo.</w:t>
+        <w:t xml:space="preserve">Các lời chào hàng, hỏi mua mà đơn vị nắm được, ghi theo ngày. Đây là phần thông tin thị trường đơn vị báo về Tập đoàn.</w:t>
       </w:r>
     </w:p>
     <w:p>
@@ -2451,9 +2591,9 @@
       <w:r>
         <w:drawing>
           <wp:inline distT="0" distB="0" distL="0" distR="0">
-            <wp:extent cx="6191250" cy="2800350"/>
+            <wp:extent cx="6191250" cy="3552825"/>
             <wp:effectExtent t="0" r="0" b="0" l="0"/>
-            <wp:docPr id="1" name="img" descr="Ảnh hướng dẫn có đánh số bước" title="img/11-ke-hoach-nam.png"/>
+            <wp:docPr id="1" name="img" descr="Ảnh hướng dẫn có đánh số bước" title="img/10-nhu-cau-thi-truong.png"/>
             <wp:cNvGraphicFramePr>
               <a:graphicFrameLocks xmlns:a="http://schemas.openxmlformats.org/drawingml/2006/main" noChangeAspect="1"/>
             </wp:cNvGraphicFramePr>
@@ -2476,7 +2616,7 @@
                   <pic:spPr bwMode="auto">
                     <a:xfrm>
                       <a:off x="0" y="0"/>
-                      <a:ext cx="6191250" cy="2800350"/>
+                      <a:ext cx="6191250" cy="3552825"/>
                     </a:xfrm>
                     <a:prstGeom prst="rect">
                       <a:avLst/>
@@ -2502,7 +2642,7 @@
           <w:sz w:val="17"/>
           <w:szCs w:val="17"/>
         </w:rPr>
-        <w:t xml:space="preserve">Hình 11. Kế hoạch năm của đơn vị</w:t>
+        <w:t xml:space="preserve">Hình 11. Nhu cầu thị trường theo ngày</w:t>
       </w:r>
     </w:p>
     <w:p>
@@ -2544,10 +2684,10 @@
           <w:b/>
           <w:bCs/>
         </w:rPr>
-        <w:t xml:space="preserve">Năm</w:t>
-      </w:r>
-      <w:r>
-        <w:t xml:space="preserve"> — chọn năm muốn xem.</w:t>
+        <w:t xml:space="preserve">Khoảng thời gian</w:t>
+      </w:r>
+      <w:r>
+        <w:t xml:space="preserve"> — 30 / 60 / 90 / 180 / 365 ngày gần nhất.</w:t>
       </w:r>
     </w:p>
     <w:p>
@@ -2560,7 +2700,7 @@
         <w:spacing w:after="100"/>
       </w:pPr>
       <w:r>
-        <w:t xml:space="preserve">Bảng chỉ tiêu: kế hoạch thu mua, kế hoạch tiêu thụ hợp đồng chuyến, hợp đồng dài hạn đã ký, phần chuyển sang từ năm trước và kế hoạch doanh thu (tỷ đồng).</w:t>
+        <w:t xml:space="preserve">Nội dung xếp theo ngày, mới nhất lên trên; mỗi dòng ghi tên đơn vị và nội dung nhu cầu.</w:t>
       </w:r>
     </w:p>
     <w:p>
@@ -2585,20 +2725,7 @@
         <w:spacing w:after="80"/>
       </w:pPr>
       <w:r>
-        <w:t xml:space="preserve">Số hiện mờ là do màn hình ở chế độ chỉ xem — đó vẫn là số thật đơn vị đã khai.</w:t>
-      </w:r>
-    </w:p>
-    <w:p>
-      <w:pPr>
-        <w:pStyle w:val="ListParagraph"/>
-        <w:numPr>
-          <w:ilvl w:val="0"/>
-          <w:numId w:val="3"/>
-        </w:numPr>
-        <w:spacing w:after="80"/>
-      </w:pPr>
-      <w:r>
-        <w:t xml:space="preserve">Chỉ tiêu sai hoặc chưa khai: báo tài khoản nhập liệu của đơn vị cập nhật.</w:t>
+        <w:t xml:space="preserve">Chỉ những ngày có nhập mới hiện. Ngày trống nghĩa là hôm đó đơn vị không ghi nhận nhu cầu nào.</w:t>
       </w:r>
     </w:p>
     <w:p>
@@ -2607,7 +2734,7 @@
         <w:pageBreakBefore/>
       </w:pPr>
       <w:r>
-        <w:t xml:space="preserve">13. Danh mục khách hàng</w:t>
+        <w:t xml:space="preserve">13. Kế hoạch năm</w:t>
       </w:r>
     </w:p>
     <w:p>
@@ -2622,7 +2749,7 @@
         <w:t xml:space="preserve">Vị trí: </w:t>
       </w:r>
       <w:r>
-        <w:t xml:space="preserve">Menu ▸ Hợp đồng (chỉ xem) ▸ Khách hàng</w:t>
+        <w:t xml:space="preserve">Menu ▸ Số liệu đơn vị (chỉ xem) ▸ Kế hoạch năm</w:t>
       </w:r>
     </w:p>
     <w:p>
@@ -2630,7 +2757,7 @@
         <w:spacing w:after="140"/>
       </w:pPr>
       <w:r>
-        <w:t xml:space="preserve">Danh sách khách hàng riêng của đơn vị. Mỗi hợp đồng đều gắn với một khách hàng ở danh mục này, nhờ đó báo cáo tách được sản lượng và doanh thu theo từng khách.</w:t>
+        <w:t xml:space="preserve">Chỉ tiêu cả năm của đơn vị — cơ sở để hệ thống tính phần trăm thực hiện trên các báo cáo.</w:t>
       </w:r>
     </w:p>
     <w:p>
@@ -2643,7 +2770,7 @@
           <wp:inline distT="0" distB="0" distL="0" distR="0">
             <wp:extent cx="6191250" cy="2800350"/>
             <wp:effectExtent t="0" r="0" b="0" l="0"/>
-            <wp:docPr id="1" name="img" descr="Ảnh hướng dẫn có đánh số bước" title="img/12-khach-hang.png"/>
+            <wp:docPr id="1" name="img" descr="Ảnh hướng dẫn có đánh số bước" title="img/11-ke-hoach-nam.png"/>
             <wp:cNvGraphicFramePr>
               <a:graphicFrameLocks xmlns:a="http://schemas.openxmlformats.org/drawingml/2006/main" noChangeAspect="1"/>
             </wp:cNvGraphicFramePr>
@@ -2692,7 +2819,7 @@
           <w:sz w:val="17"/>
           <w:szCs w:val="17"/>
         </w:rPr>
-        <w:t xml:space="preserve">Hình 12. Danh mục khách hàng của đơn vị</w:t>
+        <w:t xml:space="preserve">Hình 12. Kế hoạch năm của đơn vị</w:t>
       </w:r>
     </w:p>
     <w:p>
@@ -2734,10 +2861,10 @@
           <w:b/>
           <w:bCs/>
         </w:rPr>
-        <w:t xml:space="preserve">Ô tìm kiếm</w:t>
-      </w:r>
-      <w:r>
-        <w:t xml:space="preserve"> — tìm theo tên khách, mã khách hoặc mã số thuế.</w:t>
+        <w:t xml:space="preserve">Năm</w:t>
+      </w:r>
+      <w:r>
+        <w:t xml:space="preserve"> — chọn năm muốn xem.</w:t>
       </w:r>
     </w:p>
     <w:p>
@@ -2750,7 +2877,45 @@
         <w:spacing w:after="100"/>
       </w:pPr>
       <w:r>
-        <w:t xml:space="preserve">Bảng danh sách: mã khách, tên khách hàng, mã số thuế, trạng thái, ghi chú. Danh sách dài thì chuyển trang ở cuối bảng.</w:t>
+        <w:t xml:space="preserve">Bảng chỉ tiêu: kế hoạch thu mua, kế hoạch tiêu thụ hợp đồng chuyến, hợp đồng dài hạn đã ký, phần chuyển sang từ năm trước và kế hoạch doanh thu (tỷ đồng).</w:t>
+      </w:r>
+    </w:p>
+    <w:p>
+      <w:pPr>
+        <w:spacing w:after="80" w:before="140"/>
+      </w:pPr>
+      <w:r>
+        <w:rPr>
+          <w:b/>
+          <w:bCs/>
+        </w:rPr>
+        <w:t xml:space="preserve">Lưu ý:</w:t>
+      </w:r>
+    </w:p>
+    <w:p>
+      <w:pPr>
+        <w:pStyle w:val="ListParagraph"/>
+        <w:numPr>
+          <w:ilvl w:val="0"/>
+          <w:numId w:val="3"/>
+        </w:numPr>
+        <w:spacing w:after="80"/>
+      </w:pPr>
+      <w:r>
+        <w:t xml:space="preserve">Số hiện mờ là do màn hình ở chế độ chỉ xem — đó vẫn là số thật đơn vị đã khai.</w:t>
+      </w:r>
+    </w:p>
+    <w:p>
+      <w:pPr>
+        <w:pStyle w:val="ListParagraph"/>
+        <w:numPr>
+          <w:ilvl w:val="0"/>
+          <w:numId w:val="3"/>
+        </w:numPr>
+        <w:spacing w:after="80"/>
+      </w:pPr>
+      <w:r>
+        <w:t xml:space="preserve">Chỉ tiêu sai hoặc chưa khai: báo tài khoản nhập liệu của đơn vị cập nhật.</w:t>
       </w:r>
     </w:p>
     <w:p>
@@ -2759,7 +2924,7 @@
         <w:pageBreakBefore/>
       </w:pPr>
       <w:r>
-        <w:t xml:space="preserve">14. Hợp đồng mẹ (HĐNT/HĐDH)</w:t>
+        <w:t xml:space="preserve">14. Danh mục khách hàng</w:t>
       </w:r>
     </w:p>
     <w:p>
@@ -2774,7 +2939,7 @@
         <w:t xml:space="preserve">Vị trí: </w:t>
       </w:r>
       <w:r>
-        <w:t xml:space="preserve">Menu ▸ Hợp đồng (chỉ xem) ▸ Hợp đồng mẹ (HĐNT/HĐDH)</w:t>
+        <w:t xml:space="preserve">Menu ▸ Hợp đồng (chỉ xem) ▸ Khách hàng</w:t>
       </w:r>
     </w:p>
     <w:p>
@@ -2782,7 +2947,7 @@
         <w:spacing w:after="140"/>
       </w:pPr>
       <w:r>
-        <w:t xml:space="preserve">Hồ sơ hợp đồng nguyên tắc / hợp đồng dài hạn ký với khách: sản lượng cam kết, công thức giá, thời hạn. Các hợp đồng bán cụ thể là phụ lục thuộc hồ sơ này.</w:t>
+        <w:t xml:space="preserve">Danh sách khách hàng riêng của đơn vị. Mỗi hợp đồng đều gắn với một khách hàng ở danh mục này, nhờ đó báo cáo tách được sản lượng và doanh thu theo từng khách.</w:t>
       </w:r>
     </w:p>
     <w:p>
@@ -2795,7 +2960,7 @@
           <wp:inline distT="0" distB="0" distL="0" distR="0">
             <wp:extent cx="6191250" cy="2800350"/>
             <wp:effectExtent t="0" r="0" b="0" l="0"/>
-            <wp:docPr id="1" name="img" descr="Ảnh hướng dẫn có đánh số bước" title="img/13-hop-dong-me.png"/>
+            <wp:docPr id="1" name="img" descr="Ảnh hướng dẫn có đánh số bước" title="img/12-khach-hang.png"/>
             <wp:cNvGraphicFramePr>
               <a:graphicFrameLocks xmlns:a="http://schemas.openxmlformats.org/drawingml/2006/main" noChangeAspect="1"/>
             </wp:cNvGraphicFramePr>
@@ -2844,7 +3009,7 @@
           <w:sz w:val="17"/>
           <w:szCs w:val="17"/>
         </w:rPr>
-        <w:t xml:space="preserve">Hình 13. Danh sách hợp đồng mẹ</w:t>
+        <w:t xml:space="preserve">Hình 13. Danh mục khách hàng của đơn vị</w:t>
       </w:r>
     </w:p>
     <w:p>
@@ -2882,17 +3047,14 @@
         <w:spacing w:after="100"/>
       </w:pPr>
       <w:r>
-        <w:t xml:space="preserve">Khối bộ lọc — chọn </w:t>
-      </w:r>
-      <w:r>
-        <w:rPr>
-          <w:b/>
-          <w:bCs/>
-        </w:rPr>
-        <w:t xml:space="preserve">Loại</w:t>
-      </w:r>
-      <w:r>
-        <w:t xml:space="preserve"> hồ sơ (HĐ nguyên tắc / HĐ dài hạn) hoặc gõ số hợp đồng vào ô tìm.</w:t>
+        <w:rPr>
+          <w:b/>
+          <w:bCs/>
+        </w:rPr>
+        <w:t xml:space="preserve">Ô tìm kiếm</w:t>
+      </w:r>
+      <w:r>
+        <w:t xml:space="preserve"> — tìm theo tên khách, mã khách hoặc mã số thuế.</w:t>
       </w:r>
     </w:p>
     <w:p>
@@ -2905,72 +3067,7 @@
         <w:spacing w:after="100"/>
       </w:pPr>
       <w:r>
-        <w:t xml:space="preserve">Bảng hồ sơ: số hợp đồng, loại, khách hàng, chủng loại, </w:t>
-      </w:r>
-      <w:r>
-        <w:rPr>
-          <w:b/>
-          <w:bCs/>
-        </w:rPr>
-        <w:t xml:space="preserve">SL cam kết</w:t>
-      </w:r>
-      <w:r>
-        <w:t xml:space="preserve">, số phụ lục </w:t>
-      </w:r>
-      <w:r>
-        <w:rPr>
-          <w:b/>
-          <w:bCs/>
-        </w:rPr>
-        <w:t xml:space="preserve">đã ký</w:t>
-      </w:r>
-      <w:r>
-        <w:t xml:space="preserve"> và </w:t>
-      </w:r>
-      <w:r>
-        <w:rPr>
-          <w:b/>
-          <w:bCs/>
-        </w:rPr>
-        <w:t xml:space="preserve">hiệu lực</w:t>
-      </w:r>
-      <w:r>
-        <w:t xml:space="preserve"> đến ngày nào. Bấm </w:t>
-      </w:r>
-      <w:r>
-        <w:rPr>
-          <w:b/>
-          <w:bCs/>
-        </w:rPr>
-        <w:t xml:space="preserve">Xem</w:t>
-      </w:r>
-      <w:r>
-        <w:t xml:space="preserve"> để mở chi tiết hồ sơ.</w:t>
-      </w:r>
-    </w:p>
-    <w:p>
-      <w:pPr>
-        <w:spacing w:after="80" w:before="140"/>
-      </w:pPr>
-      <w:r>
-        <w:rPr>
-          <w:b/>
-          <w:bCs/>
-        </w:rPr>
-        <w:t xml:space="preserve">Lưu ý:</w:t>
-      </w:r>
-    </w:p>
-    <w:p>
-      <w:pPr>
-        <w:pStyle w:val="ListParagraph"/>
-        <w:numPr>
-          <w:ilvl w:val="0"/>
-          <w:numId w:val="3"/>
-        </w:numPr>
-        <w:spacing w:after="80"/>
-      </w:pPr>
-      <w:r>
-        <w:t xml:space="preserve">Hồ sơ mẹ chỉ ghi cam kết, không tính vào sản lượng tiêu thụ. Sản lượng thật nằm ở các hợp đồng và đợt giao (mục 15).</w:t>
+        <w:t xml:space="preserve">Bảng danh sách: mã khách, tên khách hàng, mã số thuế, trạng thái, ghi chú. Danh sách dài thì chuyển trang ở cuối bảng.</w:t>
       </w:r>
     </w:p>
     <w:p>
@@ -2979,7 +3076,7 @@
         <w:pageBreakBefore/>
       </w:pPr>
       <w:r>
-        <w:t xml:space="preserve">15. Hợp đồng &amp; đợt giao</w:t>
+        <w:t xml:space="preserve">15. Hợp đồng mẹ (HĐNT/HĐDH)</w:t>
       </w:r>
     </w:p>
     <w:p>
@@ -2994,7 +3091,7 @@
         <w:t xml:space="preserve">Vị trí: </w:t>
       </w:r>
       <w:r>
-        <w:t xml:space="preserve">Menu ▸ Hợp đồng (chỉ xem) ▸ Hợp đồng &amp; đợt giao</w:t>
+        <w:t xml:space="preserve">Menu ▸ Hợp đồng (chỉ xem) ▸ Hợp đồng mẹ (HĐNT/HĐDH)</w:t>
       </w:r>
     </w:p>
     <w:p>
@@ -3002,7 +3099,7 @@
         <w:spacing w:after="140"/>
       </w:pPr>
       <w:r>
-        <w:t xml:space="preserve">Toàn bộ hợp đồng bán của đơn vị và tiến độ giao hàng của từng hợp đồng.</w:t>
+        <w:t xml:space="preserve">Hồ sơ hợp đồng nguyên tắc / hợp đồng dài hạn ký với khách: sản lượng cam kết, công thức giá, thời hạn. Các hợp đồng bán cụ thể là phụ lục thuộc hồ sơ này.</w:t>
       </w:r>
     </w:p>
     <w:p>
@@ -3015,7 +3112,7 @@
           <wp:inline distT="0" distB="0" distL="0" distR="0">
             <wp:extent cx="6191250" cy="2800350"/>
             <wp:effectExtent t="0" r="0" b="0" l="0"/>
-            <wp:docPr id="1" name="img" descr="Ảnh hướng dẫn có đánh số bước" title="img/14-hop-dong-dot-giao.png"/>
+            <wp:docPr id="1" name="img" descr="Ảnh hướng dẫn có đánh số bước" title="img/13-hop-dong-me.png"/>
             <wp:cNvGraphicFramePr>
               <a:graphicFrameLocks xmlns:a="http://schemas.openxmlformats.org/drawingml/2006/main" noChangeAspect="1"/>
             </wp:cNvGraphicFramePr>
@@ -3064,7 +3161,7 @@
           <w:sz w:val="17"/>
           <w:szCs w:val="17"/>
         </w:rPr>
-        <w:t xml:space="preserve">Hình 14. Hợp đồng và tiến độ giao hàng</w:t>
+        <w:t xml:space="preserve">Hình 14. Danh sách hợp đồng mẹ</w:t>
       </w:r>
     </w:p>
     <w:p>
@@ -3102,7 +3199,17 @@
         <w:spacing w:after="100"/>
       </w:pPr>
       <w:r>
-        <w:t xml:space="preserve">Khối bộ lọc — khách hàng, hồ sơ hợp đồng mẹ, trạng thái, hình thức tiêu thụ, ngày ký, số hợp đồng.</w:t>
+        <w:t xml:space="preserve">Khối bộ lọc — chọn </w:t>
+      </w:r>
+      <w:r>
+        <w:rPr>
+          <w:b/>
+          <w:bCs/>
+        </w:rPr>
+        <w:t xml:space="preserve">Loại</w:t>
+      </w:r>
+      <w:r>
+        <w:t xml:space="preserve"> hồ sơ (HĐ nguyên tắc / HĐ dài hạn) hoặc gõ số hợp đồng vào ô tìm.</w:t>
       </w:r>
     </w:p>
     <w:p>
@@ -3115,30 +3222,37 @@
         <w:spacing w:after="100"/>
       </w:pPr>
       <w:r>
-        <w:t xml:space="preserve">Bảng hợp đồng: sản lượng, thành tiền, phần đã giao, còn phải giao, số đợt giao và trạng thái. Dòng </w:t>
-      </w:r>
-      <w:r>
-        <w:rPr>
-          <w:b/>
-          <w:bCs/>
-        </w:rPr>
-        <w:t xml:space="preserve">Tổng cộng</w:t>
-      </w:r>
-      <w:r>
-        <w:t xml:space="preserve"> tính trên toàn bộ hợp đồng khớp bộ lọc, không chỉ trang đang xem.</w:t>
-      </w:r>
-    </w:p>
-    <w:p>
-      <w:pPr>
-        <w:pStyle w:val="ListParagraph"/>
-        <w:numPr>
-          <w:ilvl w:val="0"/>
-          <w:numId w:val="17"/>
-        </w:numPr>
-        <w:spacing w:after="100"/>
-      </w:pPr>
-      <w:r>
-        <w:t xml:space="preserve">Bấm </w:t>
+        <w:t xml:space="preserve">Bảng hồ sơ: số hợp đồng, loại, khách hàng, chủng loại, </w:t>
+      </w:r>
+      <w:r>
+        <w:rPr>
+          <w:b/>
+          <w:bCs/>
+        </w:rPr>
+        <w:t xml:space="preserve">SL cam kết</w:t>
+      </w:r>
+      <w:r>
+        <w:t xml:space="preserve">, số phụ lục </w:t>
+      </w:r>
+      <w:r>
+        <w:rPr>
+          <w:b/>
+          <w:bCs/>
+        </w:rPr>
+        <w:t xml:space="preserve">đã ký</w:t>
+      </w:r>
+      <w:r>
+        <w:t xml:space="preserve"> và </w:t>
+      </w:r>
+      <w:r>
+        <w:rPr>
+          <w:b/>
+          <w:bCs/>
+        </w:rPr>
+        <w:t xml:space="preserve">hiệu lực</w:t>
+      </w:r>
+      <w:r>
+        <w:t xml:space="preserve"> đến ngày nào. Bấm </w:t>
       </w:r>
       <w:r>
         <w:rPr>
@@ -3148,7 +3262,7 @@
         <w:t xml:space="preserve">Xem</w:t>
       </w:r>
       <w:r>
-        <w:t xml:space="preserve"> ở cuối dòng để mở chi tiết hợp đồng và danh sách các đợt giao.</w:t>
+        <w:t xml:space="preserve"> để mở chi tiết hồ sơ.</w:t>
       </w:r>
     </w:p>
     <w:p>
@@ -3173,27 +3287,7 @@
         <w:spacing w:after="80"/>
       </w:pPr>
       <w:r>
-        <w:t xml:space="preserve">Trạng thái thường gặp: </w:t>
-      </w:r>
-      <w:r>
-        <w:rPr>
-          <w:b/>
-          <w:bCs/>
-        </w:rPr>
-        <w:t xml:space="preserve">Đã giao đủ</w:t>
-      </w:r>
-      <w:r>
-        <w:t xml:space="preserve">, </w:t>
-      </w:r>
-      <w:r>
-        <w:rPr>
-          <w:b/>
-          <w:bCs/>
-        </w:rPr>
-        <w:t xml:space="preserve">Đang thực hiện</w:t>
-      </w:r>
-      <w:r>
-        <w:t xml:space="preserve">. Cột *Còn phải giao* là phần đã ký nhưng chưa giao.</w:t>
+        <w:t xml:space="preserve">Hồ sơ mẹ chỉ ghi cam kết, không tính vào sản lượng tiêu thụ. Sản lượng thật nằm ở các hợp đồng và đợt giao (mục 16).</w:t>
       </w:r>
     </w:p>
     <w:p>
@@ -3202,7 +3296,7 @@
         <w:pageBreakBefore/>
       </w:pPr>
       <w:r>
-        <w:t xml:space="preserve">16. Báo cáo tiêu thụ</w:t>
+        <w:t xml:space="preserve">16. Hợp đồng &amp; đợt giao</w:t>
       </w:r>
     </w:p>
     <w:p>
@@ -3217,7 +3311,7 @@
         <w:t xml:space="preserve">Vị trí: </w:t>
       </w:r>
       <w:r>
-        <w:t xml:space="preserve">Menu ▸ Báo cáo ▸ Tiêu thụ</w:t>
+        <w:t xml:space="preserve">Menu ▸ Hợp đồng (chỉ xem) ▸ Hợp đồng &amp; đợt giao</w:t>
       </w:r>
     </w:p>
     <w:p>
@@ -3225,7 +3319,7 @@
         <w:spacing w:after="140"/>
       </w:pPr>
       <w:r>
-        <w:t xml:space="preserve">Bức tranh tiêu thụ của đơn vị theo kỳ: giao bao nhiêu, cho ai, doanh thu bao nhiêu, còn phải giao bao nhiêu. Số liệu cộng từ các lần giao ghi trên hợp đồng.</w:t>
+        <w:t xml:space="preserve">Toàn bộ hợp đồng bán của đơn vị và tiến độ giao hàng của từng hợp đồng.</w:t>
       </w:r>
     </w:p>
     <w:p>
@@ -3238,7 +3332,7 @@
           <wp:inline distT="0" distB="0" distL="0" distR="0">
             <wp:extent cx="6191250" cy="2800350"/>
             <wp:effectExtent t="0" r="0" b="0" l="0"/>
-            <wp:docPr id="1" name="img" descr="Ảnh hướng dẫn có đánh số bước" title="img/15-bao-cao-tieu-thu.png"/>
+            <wp:docPr id="1" name="img" descr="Ảnh hướng dẫn có đánh số bước" title="img/14-hop-dong-dot-giao.png"/>
             <wp:cNvGraphicFramePr>
               <a:graphicFrameLocks xmlns:a="http://schemas.openxmlformats.org/drawingml/2006/main" noChangeAspect="1"/>
             </wp:cNvGraphicFramePr>
@@ -3287,7 +3381,7 @@
           <w:sz w:val="17"/>
           <w:szCs w:val="17"/>
         </w:rPr>
-        <w:t xml:space="preserve">Hình 15. Báo cáo tiêu thụ theo kỳ</w:t>
+        <w:t xml:space="preserve">Hình 15. Hợp đồng và tiến độ giao hàng</w:t>
       </w:r>
     </w:p>
     <w:p>
@@ -3312,27 +3406,7 @@
         <w:spacing w:after="100"/>
       </w:pPr>
       <w:r>
-        <w:t xml:space="preserve">Chọn kỳ ở </w:t>
-      </w:r>
-      <w:r>
-        <w:rPr>
-          <w:b/>
-          <w:bCs/>
-        </w:rPr>
-        <w:t xml:space="preserve">Từ ngày</w:t>
-      </w:r>
-      <w:r>
-        <w:t xml:space="preserve"> – </w:t>
-      </w:r>
-      <w:r>
-        <w:rPr>
-          <w:b/>
-          <w:bCs/>
-        </w:rPr>
-        <w:t xml:space="preserve">Đến ngày</w:t>
-      </w:r>
-      <w:r>
-        <w:t xml:space="preserve"> (mặc định từ đầu tháng đến hôm nay), lọc thêm theo khách hàng hoặc chủng loại nếu cần.</w:t>
+        <w:t xml:space="preserve">Dòng thông báo chế độ chỉ xem.</w:t>
       </w:r>
     </w:p>
     <w:p>
@@ -3345,14 +3419,7 @@
         <w:spacing w:after="100"/>
       </w:pPr>
       <w:r>
-        <w:rPr>
-          <w:b/>
-          <w:bCs/>
-        </w:rPr>
-        <w:t xml:space="preserve">Xuất Excel</w:t>
-      </w:r>
-      <w:r>
-        <w:t xml:space="preserve"> — tải file gồm 2 sheet: tổng hợp theo đơn vị và chi tiết từng dòng bán.</w:t>
+        <w:t xml:space="preserve">Khối bộ lọc — khách hàng, hồ sơ hợp đồng mẹ, trạng thái, hình thức tiêu thụ, ngày ký, số hợp đồng.</w:t>
       </w:r>
     </w:p>
     <w:p>
@@ -3365,17 +3432,17 @@
         <w:spacing w:after="100"/>
       </w:pPr>
       <w:r>
-        <w:t xml:space="preserve">Các ô số lớn ở giữa: sản lượng tiêu thụ, doanh thu, số lần giao và phần </w:t>
-      </w:r>
-      <w:r>
-        <w:rPr>
-          <w:b/>
-          <w:bCs/>
-        </w:rPr>
-        <w:t xml:space="preserve">đã ký chưa giao</w:t>
-      </w:r>
-      <w:r>
-        <w:t xml:space="preserve"> tại ngày cuối kỳ.</w:t>
+        <w:t xml:space="preserve">Bảng hợp đồng: sản lượng, thành tiền, phần đã giao, còn phải giao, số đợt giao và trạng thái. Dòng </w:t>
+      </w:r>
+      <w:r>
+        <w:rPr>
+          <w:b/>
+          <w:bCs/>
+        </w:rPr>
+        <w:t xml:space="preserve">Tổng cộng</w:t>
+      </w:r>
+      <w:r>
+        <w:t xml:space="preserve"> tính trên toàn bộ hợp đồng khớp bộ lọc, không chỉ trang đang xem.</w:t>
       </w:r>
     </w:p>
     <w:p>
@@ -3388,7 +3455,17 @@
         <w:spacing w:after="100"/>
       </w:pPr>
       <w:r>
-        <w:t xml:space="preserve">Bảng bên dưới tách theo hình thức: xuất khẩu, trong nước, nội bộ; kèm dòng lũy kế cả kỳ.</w:t>
+        <w:t xml:space="preserve">Bấm </w:t>
+      </w:r>
+      <w:r>
+        <w:rPr>
+          <w:b/>
+          <w:bCs/>
+        </w:rPr>
+        <w:t xml:space="preserve">Xem</w:t>
+      </w:r>
+      <w:r>
+        <w:t xml:space="preserve"> ở cuối dòng để mở chi tiết hợp đồng và danh sách các đợt giao.</w:t>
       </w:r>
     </w:p>
     <w:p>
@@ -3413,30 +3490,27 @@
         <w:spacing w:after="80"/>
       </w:pPr>
       <w:r>
-        <w:t xml:space="preserve">Sản lượng tính theo </w:t>
-      </w:r>
-      <w:r>
-        <w:rPr>
-          <w:b/>
-          <w:bCs/>
-        </w:rPr>
-        <w:t xml:space="preserve">quy khô</w:t>
-      </w:r>
-      <w:r>
-        <w:t xml:space="preserve">. Doanh thu tính theo tỷ đồng.</w:t>
-      </w:r>
-    </w:p>
-    <w:p>
-      <w:pPr>
-        <w:pStyle w:val="ListParagraph"/>
-        <w:numPr>
-          <w:ilvl w:val="0"/>
-          <w:numId w:val="3"/>
-        </w:numPr>
-        <w:spacing w:after="80"/>
-      </w:pPr>
-      <w:r>
-        <w:t xml:space="preserve">Số ở đây luôn khớp với mục *Hợp đồng &amp; đợt giao* vì cùng lấy từ các lần giao.</w:t>
+        <w:t xml:space="preserve">Trạng thái thường gặp: </w:t>
+      </w:r>
+      <w:r>
+        <w:rPr>
+          <w:b/>
+          <w:bCs/>
+        </w:rPr>
+        <w:t xml:space="preserve">Đã giao đủ</w:t>
+      </w:r>
+      <w:r>
+        <w:t xml:space="preserve">, </w:t>
+      </w:r>
+      <w:r>
+        <w:rPr>
+          <w:b/>
+          <w:bCs/>
+        </w:rPr>
+        <w:t xml:space="preserve">Đang thực hiện</w:t>
+      </w:r>
+      <w:r>
+        <w:t xml:space="preserve">. Cột *Còn phải giao* là phần đã ký nhưng chưa giao.</w:t>
       </w:r>
     </w:p>
     <w:p>
@@ -3445,7 +3519,7 @@
         <w:pageBreakBefore/>
       </w:pPr>
       <w:r>
-        <w:t xml:space="preserve">17. Đổi mật khẩu</w:t>
+        <w:t xml:space="preserve">17. Báo cáo tiêu thụ</w:t>
       </w:r>
     </w:p>
     <w:p>
@@ -3460,7 +3534,7 @@
         <w:t xml:space="preserve">Vị trí: </w:t>
       </w:r>
       <w:r>
-        <w:t xml:space="preserve">Menu ▸ Hồ sơ cá nhân</w:t>
+        <w:t xml:space="preserve">Menu ▸ Báo cáo ▸ Tiêu thụ</w:t>
       </w:r>
     </w:p>
     <w:p>
@@ -3468,7 +3542,7 @@
         <w:spacing w:after="140"/>
       </w:pPr>
       <w:r>
-        <w:t xml:space="preserve">Nên đổi mật khẩu ngay sau lần đăng nhập đầu tiên.</w:t>
+        <w:t xml:space="preserve">Bức tranh tiêu thụ của đơn vị theo kỳ: giao bao nhiêu, cho ai, doanh thu bao nhiêu, còn phải giao bao nhiêu. Số liệu cộng từ các lần giao ghi trên hợp đồng.</w:t>
       </w:r>
     </w:p>
     <w:p>
@@ -3479,9 +3553,9 @@
       <w:r>
         <w:drawing>
           <wp:inline distT="0" distB="0" distL="0" distR="0">
-            <wp:extent cx="6191250" cy="3552825"/>
+            <wp:extent cx="6191250" cy="2800350"/>
             <wp:effectExtent t="0" r="0" b="0" l="0"/>
-            <wp:docPr id="1" name="img" descr="Ảnh hướng dẫn có đánh số bước" title="img/16-ho-so.png"/>
+            <wp:docPr id="1" name="img" descr="Ảnh hướng dẫn có đánh số bước" title="img/15-bao-cao-tieu-thu.png"/>
             <wp:cNvGraphicFramePr>
               <a:graphicFrameLocks xmlns:a="http://schemas.openxmlformats.org/drawingml/2006/main" noChangeAspect="1"/>
             </wp:cNvGraphicFramePr>
@@ -3504,6 +3578,249 @@
                   <pic:spPr bwMode="auto">
                     <a:xfrm>
                       <a:off x="0" y="0"/>
+                      <a:ext cx="6191250" cy="2800350"/>
+                    </a:xfrm>
+                    <a:prstGeom prst="rect">
+                      <a:avLst/>
+                    </a:prstGeom>
+                  </pic:spPr>
+                </pic:pic>
+              </a:graphicData>
+            </a:graphic>
+          </wp:inline>
+        </w:drawing>
+      </w:r>
+    </w:p>
+    <w:p>
+      <w:pPr>
+        <w:spacing w:after="180"/>
+        <w:jc w:val="center"/>
+      </w:pPr>
+      <w:r>
+        <w:rPr>
+          <w:i/>
+          <w:iCs/>
+          <w:color w:val="888888"/>
+          <w:sz w:val="17"/>
+          <w:szCs w:val="17"/>
+        </w:rPr>
+        <w:t xml:space="preserve">Hình 16. Báo cáo tiêu thụ theo kỳ</w:t>
+      </w:r>
+    </w:p>
+    <w:p>
+      <w:pPr>
+        <w:spacing w:after="80"/>
+      </w:pPr>
+      <w:r>
+        <w:rPr>
+          <w:b/>
+          <w:bCs/>
+        </w:rPr>
+        <w:t xml:space="preserve">Các bước:</w:t>
+      </w:r>
+    </w:p>
+    <w:p>
+      <w:pPr>
+        <w:pStyle w:val="ListParagraph"/>
+        <w:numPr>
+          <w:ilvl w:val="0"/>
+          <w:numId w:val="19"/>
+        </w:numPr>
+        <w:spacing w:after="100"/>
+      </w:pPr>
+      <w:r>
+        <w:t xml:space="preserve">Chọn kỳ ở </w:t>
+      </w:r>
+      <w:r>
+        <w:rPr>
+          <w:b/>
+          <w:bCs/>
+        </w:rPr>
+        <w:t xml:space="preserve">Từ ngày</w:t>
+      </w:r>
+      <w:r>
+        <w:t xml:space="preserve"> – </w:t>
+      </w:r>
+      <w:r>
+        <w:rPr>
+          <w:b/>
+          <w:bCs/>
+        </w:rPr>
+        <w:t xml:space="preserve">Đến ngày</w:t>
+      </w:r>
+      <w:r>
+        <w:t xml:space="preserve"> (mặc định từ đầu tháng đến hôm nay), lọc thêm theo khách hàng hoặc chủng loại nếu cần.</w:t>
+      </w:r>
+    </w:p>
+    <w:p>
+      <w:pPr>
+        <w:pStyle w:val="ListParagraph"/>
+        <w:numPr>
+          <w:ilvl w:val="0"/>
+          <w:numId w:val="19"/>
+        </w:numPr>
+        <w:spacing w:after="100"/>
+      </w:pPr>
+      <w:r>
+        <w:rPr>
+          <w:b/>
+          <w:bCs/>
+        </w:rPr>
+        <w:t xml:space="preserve">Xuất Excel</w:t>
+      </w:r>
+      <w:r>
+        <w:t xml:space="preserve"> — tải file gồm 2 sheet: tổng hợp theo đơn vị và chi tiết từng dòng bán.</w:t>
+      </w:r>
+    </w:p>
+    <w:p>
+      <w:pPr>
+        <w:pStyle w:val="ListParagraph"/>
+        <w:numPr>
+          <w:ilvl w:val="0"/>
+          <w:numId w:val="19"/>
+        </w:numPr>
+        <w:spacing w:after="100"/>
+      </w:pPr>
+      <w:r>
+        <w:t xml:space="preserve">Các ô số lớn ở giữa: sản lượng tiêu thụ, doanh thu, số lần giao và phần </w:t>
+      </w:r>
+      <w:r>
+        <w:rPr>
+          <w:b/>
+          <w:bCs/>
+        </w:rPr>
+        <w:t xml:space="preserve">đã ký chưa giao</w:t>
+      </w:r>
+      <w:r>
+        <w:t xml:space="preserve"> tại ngày cuối kỳ.</w:t>
+      </w:r>
+    </w:p>
+    <w:p>
+      <w:pPr>
+        <w:pStyle w:val="ListParagraph"/>
+        <w:numPr>
+          <w:ilvl w:val="0"/>
+          <w:numId w:val="19"/>
+        </w:numPr>
+        <w:spacing w:after="100"/>
+      </w:pPr>
+      <w:r>
+        <w:t xml:space="preserve">Bảng bên dưới tách theo hình thức: xuất khẩu, trong nước, nội bộ; kèm dòng lũy kế cả kỳ.</w:t>
+      </w:r>
+    </w:p>
+    <w:p>
+      <w:pPr>
+        <w:spacing w:after="80" w:before="140"/>
+      </w:pPr>
+      <w:r>
+        <w:rPr>
+          <w:b/>
+          <w:bCs/>
+        </w:rPr>
+        <w:t xml:space="preserve">Lưu ý:</w:t>
+      </w:r>
+    </w:p>
+    <w:p>
+      <w:pPr>
+        <w:pStyle w:val="ListParagraph"/>
+        <w:numPr>
+          <w:ilvl w:val="0"/>
+          <w:numId w:val="3"/>
+        </w:numPr>
+        <w:spacing w:after="80"/>
+      </w:pPr>
+      <w:r>
+        <w:t xml:space="preserve">Sản lượng tính theo </w:t>
+      </w:r>
+      <w:r>
+        <w:rPr>
+          <w:b/>
+          <w:bCs/>
+        </w:rPr>
+        <w:t xml:space="preserve">quy khô</w:t>
+      </w:r>
+      <w:r>
+        <w:t xml:space="preserve">. Doanh thu tính theo tỷ đồng.</w:t>
+      </w:r>
+    </w:p>
+    <w:p>
+      <w:pPr>
+        <w:pStyle w:val="ListParagraph"/>
+        <w:numPr>
+          <w:ilvl w:val="0"/>
+          <w:numId w:val="3"/>
+        </w:numPr>
+        <w:spacing w:after="80"/>
+      </w:pPr>
+      <w:r>
+        <w:t xml:space="preserve">Số ở đây luôn khớp với mục *Hợp đồng &amp; đợt giao* vì cùng lấy từ các lần giao.</w:t>
+      </w:r>
+    </w:p>
+    <w:p>
+      <w:pPr>
+        <w:pStyle w:val="Heading2"/>
+        <w:pageBreakBefore/>
+      </w:pPr>
+      <w:r>
+        <w:t xml:space="preserve">18. Đổi mật khẩu</w:t>
+      </w:r>
+    </w:p>
+    <w:p>
+      <w:pPr>
+        <w:spacing w:after="60"/>
+      </w:pPr>
+      <w:r>
+        <w:rPr>
+          <w:b/>
+          <w:bCs/>
+        </w:rPr>
+        <w:t xml:space="preserve">Vị trí: </w:t>
+      </w:r>
+      <w:r>
+        <w:t xml:space="preserve">Menu ▸ Hồ sơ cá nhân</w:t>
+      </w:r>
+    </w:p>
+    <w:p>
+      <w:pPr>
+        <w:spacing w:after="140"/>
+      </w:pPr>
+      <w:r>
+        <w:t xml:space="preserve">Nên đổi mật khẩu ngay sau lần đăng nhập đầu tiên.</w:t>
+      </w:r>
+    </w:p>
+    <w:p>
+      <w:pPr>
+        <w:spacing w:after="60" w:before="60"/>
+        <w:jc w:val="center"/>
+      </w:pPr>
+      <w:r>
+        <w:drawing>
+          <wp:inline distT="0" distB="0" distL="0" distR="0">
+            <wp:extent cx="6191250" cy="3552825"/>
+            <wp:effectExtent t="0" r="0" b="0" l="0"/>
+            <wp:docPr id="1" name="img" descr="Ảnh hướng dẫn có đánh số bước" title="img/16-ho-so.png"/>
+            <wp:cNvGraphicFramePr>
+              <a:graphicFrameLocks xmlns:a="http://schemas.openxmlformats.org/drawingml/2006/main" noChangeAspect="1"/>
+            </wp:cNvGraphicFramePr>
+            <a:graphic xmlns:a="http://schemas.openxmlformats.org/drawingml/2006/main">
+              <a:graphicData uri="http://schemas.openxmlformats.org/drawingml/2006/picture">
+                <pic:pic xmlns:pic="http://schemas.openxmlformats.org/drawingml/2006/picture">
+                  <pic:nvPicPr>
+                    <pic:cNvPr id="0" name="" descr=""/>
+                    <pic:cNvPicPr>
+                      <a:picLocks noChangeAspect="1" noChangeArrowheads="1"/>
+                    </pic:cNvPicPr>
+                  </pic:nvPicPr>
+                  <pic:blipFill>
+                    <a:blip r:embed="rId24" cstate="none"/>
+                    <a:srcRect/>
+                    <a:stretch>
+                      <a:fillRect/>
+                    </a:stretch>
+                  </pic:blipFill>
+                  <pic:spPr bwMode="auto">
+                    <a:xfrm>
+                      <a:off x="0" y="0"/>
                       <a:ext cx="6191250" cy="3552825"/>
                     </a:xfrm>
                     <a:prstGeom prst="rect">
@@ -3530,7 +3847,7 @@
           <w:sz w:val="17"/>
           <w:szCs w:val="17"/>
         </w:rPr>
-        <w:t xml:space="preserve">Hình 16. Đổi mật khẩu</w:t>
+        <w:t xml:space="preserve">Hình 17. Đổi mật khẩu</w:t>
       </w:r>
     </w:p>
     <w:p>
@@ -3550,7 +3867,7 @@
         <w:pStyle w:val="ListParagraph"/>
         <w:numPr>
           <w:ilvl w:val="0"/>
-          <w:numId w:val="19"/>
+          <w:numId w:val="20"/>
         </w:numPr>
         <w:spacing w:after="100"/>
       </w:pPr>
@@ -3573,7 +3890,7 @@
         <w:pStyle w:val="ListParagraph"/>
         <w:numPr>
           <w:ilvl w:val="0"/>
-          <w:numId w:val="19"/>
+          <w:numId w:val="20"/>
         </w:numPr>
         <w:spacing w:after="100"/>
       </w:pPr>
@@ -3596,7 +3913,7 @@
         <w:pStyle w:val="ListParagraph"/>
         <w:numPr>
           <w:ilvl w:val="0"/>
-          <w:numId w:val="19"/>
+          <w:numId w:val="20"/>
         </w:numPr>
         <w:spacing w:after="100"/>
       </w:pPr>
@@ -3619,7 +3936,7 @@
         <w:pStyle w:val="ListParagraph"/>
         <w:numPr>
           <w:ilvl w:val="0"/>
-          <w:numId w:val="19"/>
+          <w:numId w:val="20"/>
         </w:numPr>
         <w:spacing w:after="100"/>
       </w:pPr>
@@ -3691,7 +4008,7 @@
         <w:pageBreakBefore/>
       </w:pPr>
       <w:r>
-        <w:t xml:space="preserve">18. Những tình huống hay gặp</w:t>
+        <w:t xml:space="preserve">19. Những tình huống hay gặp</w:t>
       </w:r>
     </w:p>
     <w:p>
@@ -3750,7 +4067,43 @@
         <w:spacing w:after="80"/>
       </w:pPr>
       <w:r>
-        <w:t xml:space="preserve">Muốn sửa số đã nhập nhưng kỳ đã khoá → Gửi yêu cầu hỗ trợ lên Tập đoàn (mục 4), nêu rõ ngày và số cần sửa.</w:t>
+        <w:t xml:space="preserve">Cảnh báo báo “chưa nộp” nhưng nhân viên nói đã nộp → Cột ghi số ngày còn thiếu trên tổng số ngày của khoảng đang xem. Mở Thu mua hoặc Tồn kho theo ngày để xem đúng ngày nào còn trống.</w:t>
+      </w:r>
+    </w:p>
+    <w:p>
+      <w:pPr>
+        <w:pStyle w:val="ListParagraph"/>
+        <w:numPr>
+          <w:ilvl w:val="0"/>
+          <w:numId w:val="3"/>
+        </w:numPr>
+        <w:spacing w:after="80"/>
+      </w:pPr>
+      <w:r>
+        <w:t xml:space="preserve">Cảnh báo báo giá sai nhưng số thật sự đúng → Cảnh báo chỉ là dấu hiệu cần kiểm tra. Nếu đã đối chiếu và số đúng thì báo Tập đoàn qua Hỗ trợ &amp; Thông báo.</w:t>
+      </w:r>
+    </w:p>
+    <w:p>
+      <w:pPr>
+        <w:pStyle w:val="ListParagraph"/>
+        <w:numPr>
+          <w:ilvl w:val="0"/>
+          <w:numId w:val="3"/>
+        </w:numPr>
+        <w:spacing w:after="80"/>
+      </w:pPr>
+      <w:r>
+        <w:t xml:space="preserve">Muốn sửa số đã nhập nhưng kỳ đã khoá → Nhắc nhân viên nhập liệu gửi </w:t>
+      </w:r>
+      <w:r>
+        <w:rPr>
+          <w:b/>
+          <w:bCs/>
+        </w:rPr>
+        <w:t xml:space="preserve">Đề nghị sửa số liệu</w:t>
+      </w:r>
+      <w:r>
+        <w:t xml:space="preserve">; Tập đoàn duyệt xong số mới được cập nhật.</w:t>
       </w:r>
     </w:p>
     <w:p>
@@ -4274,6 +4627,18 @@
     <w:multiLevelType w:val="hybridMultilevel"/>
     <w:lvl w:ilvl="0" w15:tentative="1">
       <w:start w:val="1"/>
+      <w:numFmt w:val="decimal"/>
+      <w:lvlText w:val="%1."/>
+      <w:lvlJc w:val="left"/>
+      <w:pPr>
+        <w:ind w:left="620" w:hanging="360"/>
+      </w:pPr>
+    </w:lvl>
+  </w:abstractNum>
+  <w:abstractNum w:abstractNumId="21" w15:restartNumberingAfterBreak="0">
+    <w:multiLevelType w:val="hybridMultilevel"/>
+    <w:lvl w:ilvl="0" w15:tentative="1">
+      <w:start w:val="1"/>
       <w:numFmt w:val="bullet"/>
       <w:lvlText w:val="•"/>
       <w:lvlJc w:val="left"/>
@@ -4295,7 +4660,7 @@
     </w:lvlOverride>
   </w:num>
   <w:num w:numId="3">
-    <w:abstractNumId w:val="20"/>
+    <w:abstractNumId w:val="21"/>
     <w:lvlOverride w:ilvl="0">
       <w:startOverride w:val="1"/>
     </w:lvlOverride>
@@ -4392,6 +4757,12 @@
   </w:num>
   <w:num w:numId="19">
     <w:abstractNumId w:val="18"/>
+    <w:lvlOverride w:ilvl="0">
+      <w:startOverride w:val="1"/>
+    </w:lvlOverride>
+  </w:num>
+  <w:num w:numId="20">
+    <w:abstractNumId w:val="19"/>
     <w:lvlOverride w:ilvl="0">
       <w:startOverride w:val="1"/>
     </w:lvlOverride>

</xml_diff>